<commit_message>
feat(memo-90): upgrade บันทึกข้อความ_90_วัน to Ref. 90-day 17pt uniform standard and save reference
</commit_message>
<xml_diff>
--- a/frontend/static/docs/บันทึกข้อความ_90_วัน_Rebuild_Thai.docx
+++ b/frontend/static/docs/บันทึกข้อความ_90_วัน_Rebuild_Thai.docx
@@ -4,48 +4,44 @@
   <w:body>
     <w:p>
       <w:pPr>
+        <w:spacing w:after="40"/>
         <w:jc w:val="center"/>
       </w:pPr>
       <w:r>
         <w:rPr>
           <w:rFonts w:ascii="TH Sarabun PSK" w:hAnsi="TH Sarabun PSK"/>
           <w:b w:val="0"/>
-          <w:sz w:val="24"/>
+          <w:i w:val="0"/>
+          <w:sz w:val="26"/>
           <w:rFonts w:ascii="TH Sarabun PSK" w:hAnsi="TH Sarabun PSK" w:cs="TH Sarabun PSK"/>
         </w:rPr>
-        <w:t>(สำเนาคู่ฉบับ)</w:t>
+        <w:t>( สำเนาคู่ฉบับ )</w:t>
       </w:r>
     </w:p>
     <w:tbl>
       <w:tblPr>
         <w:tblW w:type="auto" w:w="0"/>
         <w:jc w:val="center"/>
-        <w:tblLayout w:type="fixed"/>
         <w:tblLook w:firstColumn="1" w:firstRow="1" w:lastColumn="0" w:lastRow="0" w:noHBand="0" w:noVBand="1" w:val="04A0"/>
       </w:tblPr>
       <w:tblGrid>
-        <w:gridCol w:w="4680"/>
-        <w:gridCol w:w="4680"/>
+        <w:gridCol w:w="4824"/>
+        <w:gridCol w:w="4824"/>
       </w:tblGrid>
       <w:tr>
         <w:tc>
           <w:tcPr>
-            <w:tcW w:type="dxa" w:w="2160"/>
-            <w:tcBorders>
-              <w:top w:val="none"/>
-              <w:left w:val="none"/>
-              <w:bottom w:val="none"/>
-              <w:right w:val="none"/>
-            </w:tcBorders>
+            <w:tcW w:type="dxa" w:w="1728"/>
+            <w:tcBorders/>
           </w:tcPr>
           <w:p>
             <w:pPr>
-              <w:jc w:val="left"/>
+              <w:spacing w:after="0"/>
             </w:pPr>
             <w:r>
               <w:drawing>
                 <wp:inline xmlns:a="http://schemas.openxmlformats.org/drawingml/2006/main" xmlns:pic="http://schemas.openxmlformats.org/drawingml/2006/picture">
-                  <wp:extent cx="1097280" cy="1254034"/>
+                  <wp:extent cx="1078992" cy="1078992"/>
                   <wp:docPr id="1" name="Picture 1"/>
                   <wp:cNvGraphicFramePr>
                     <a:graphicFrameLocks noChangeAspect="1"/>
@@ -66,7 +62,7 @@
                         <pic:spPr>
                           <a:xfrm>
                             <a:off x="0" y="0"/>
-                            <a:ext cx="1097280" cy="1254034"/>
+                            <a:ext cx="1078992" cy="1078992"/>
                           </a:xfrm>
                           <a:prstGeom prst="rect"/>
                         </pic:spPr>
@@ -80,24 +76,20 @@
         </w:tc>
         <w:tc>
           <w:tcPr>
-            <w:tcW w:type="dxa" w:w="7200"/>
-            <w:tcBorders>
-              <w:top w:val="none"/>
-              <w:left w:val="none"/>
-              <w:bottom w:val="none"/>
-              <w:right w:val="none"/>
-            </w:tcBorders>
+            <w:tcW w:type="dxa" w:w="7920"/>
+            <w:tcBorders/>
           </w:tcPr>
           <w:p>
             <w:pPr>
-              <w:spacing w:before="280"/>
+              <w:spacing w:before="280" w:after="0"/>
               <w:jc w:val="center"/>
             </w:pPr>
             <w:r>
               <w:rPr>
                 <w:rFonts w:ascii="TH Sarabun PSK" w:hAnsi="TH Sarabun PSK"/>
                 <w:b/>
-                <w:sz w:val="48"/>
+                <w:i w:val="0"/>
+                <w:sz w:val="58"/>
                 <w:rFonts w:ascii="TH Sarabun PSK" w:hAnsi="TH Sarabun PSK" w:cs="TH Sarabun PSK"/>
               </w:rPr>
               <w:t>บันทึกข้อความ</w:t>
@@ -108,13 +100,14 @@
     </w:tbl>
     <w:p>
       <w:pPr>
-        <w:spacing w:after="40" w:line="360" w:lineRule="auto"/>
+        <w:spacing w:after="40" w:line="300" w:lineRule="auto"/>
       </w:pPr>
       <w:r>
         <w:rPr>
           <w:rFonts w:ascii="TH Sarabun PSK" w:hAnsi="TH Sarabun PSK"/>
           <w:b/>
-          <w:sz w:val="28"/>
+          <w:i w:val="0"/>
+          <w:sz w:val="40"/>
           <w:rFonts w:ascii="TH Sarabun PSK" w:hAnsi="TH Sarabun PSK" w:cs="TH Sarabun PSK"/>
         </w:rPr>
         <w:t xml:space="preserve">ส่วนราชการ  </w:t>
@@ -123,7 +116,8 @@
         <w:rPr>
           <w:rFonts w:ascii="TH Sarabun PSK" w:hAnsi="TH Sarabun PSK"/>
           <w:b w:val="0"/>
-          <w:sz w:val="24"/>
+          <w:i w:val="0"/>
+          <w:sz w:val="34"/>
           <w:rFonts w:ascii="TH Sarabun PSK" w:hAnsi="TH Sarabun PSK" w:cs="TH Sarabun PSK"/>
         </w:rPr>
         <w:t>ป.๔ พัน.๔ ร้อย.๒  (โทร ๓๑๑๙๓)</w:t>
@@ -131,13 +125,14 @@
     </w:p>
     <w:p>
       <w:pPr>
-        <w:spacing w:after="40" w:line="360" w:lineRule="auto"/>
+        <w:spacing w:after="40" w:line="300" w:lineRule="auto"/>
       </w:pPr>
       <w:r>
         <w:rPr>
           <w:rFonts w:ascii="TH Sarabun PSK" w:hAnsi="TH Sarabun PSK"/>
           <w:b/>
-          <w:sz w:val="28"/>
+          <w:i w:val="0"/>
+          <w:sz w:val="40"/>
           <w:rFonts w:ascii="TH Sarabun PSK" w:hAnsi="TH Sarabun PSK" w:cs="TH Sarabun PSK"/>
         </w:rPr>
         <w:t xml:space="preserve">ที่  กห ๐๔๘๓.๑.๔.๑/  </w:t>
@@ -146,7 +141,8 @@
         <w:rPr>
           <w:rFonts w:ascii="TH Sarabun PSK" w:hAnsi="TH Sarabun PSK"/>
           <w:b w:val="0"/>
-          <w:sz w:val="24"/>
+          <w:i w:val="0"/>
+          <w:sz w:val="34"/>
           <w:rFonts w:ascii="TH Sarabun PSK" w:hAnsi="TH Sarabun PSK" w:cs="TH Sarabun PSK"/>
         </w:rPr>
         <w:t>วันที่            ก.ย. ๖๙</w:t>
@@ -154,13 +150,14 @@
     </w:p>
     <w:p>
       <w:pPr>
-        <w:spacing w:after="40" w:line="360" w:lineRule="auto"/>
+        <w:spacing w:after="40" w:line="300" w:lineRule="auto"/>
       </w:pPr>
       <w:r>
         <w:rPr>
           <w:rFonts w:ascii="TH Sarabun PSK" w:hAnsi="TH Sarabun PSK"/>
           <w:b/>
-          <w:sz w:val="28"/>
+          <w:i w:val="0"/>
+          <w:sz w:val="40"/>
           <w:rFonts w:ascii="TH Sarabun PSK" w:hAnsi="TH Sarabun PSK" w:cs="TH Sarabun PSK"/>
         </w:rPr>
         <w:t xml:space="preserve">เรื่อง  </w:t>
@@ -169,7 +166,8 @@
         <w:rPr>
           <w:rFonts w:ascii="TH Sarabun PSK" w:hAnsi="TH Sarabun PSK"/>
           <w:b w:val="0"/>
-          <w:sz w:val="24"/>
+          <w:i w:val="0"/>
+          <w:sz w:val="34"/>
           <w:rFonts w:ascii="TH Sarabun PSK" w:hAnsi="TH Sarabun PSK" w:cs="TH Sarabun PSK"/>
         </w:rPr>
         <w:t>ขอส่งใบติดตามใบส่งซ่อมเกิน ๙๐ วัน</w:t>
@@ -177,13 +175,14 @@
     </w:p>
     <w:p>
       <w:pPr>
-        <w:spacing w:after="40" w:line="360" w:lineRule="auto"/>
+        <w:spacing w:after="40" w:line="300" w:lineRule="auto"/>
       </w:pPr>
       <w:r>
         <w:rPr>
           <w:rFonts w:ascii="TH Sarabun PSK" w:hAnsi="TH Sarabun PSK"/>
           <w:b/>
-          <w:sz w:val="28"/>
+          <w:i w:val="0"/>
+          <w:sz w:val="40"/>
           <w:rFonts w:ascii="TH Sarabun PSK" w:hAnsi="TH Sarabun PSK" w:cs="TH Sarabun PSK"/>
         </w:rPr>
         <w:t xml:space="preserve">เรียน  </w:t>
@@ -192,7 +191,8 @@
         <w:rPr>
           <w:rFonts w:ascii="TH Sarabun PSK" w:hAnsi="TH Sarabun PSK"/>
           <w:b w:val="0"/>
-          <w:sz w:val="24"/>
+          <w:i w:val="0"/>
+          <w:sz w:val="34"/>
           <w:rFonts w:ascii="TH Sarabun PSK" w:hAnsi="TH Sarabun PSK" w:cs="TH Sarabun PSK"/>
         </w:rPr>
         <w:t>ผบ.ป.๔ พัน.๔ (ผ่าน หมู่ส่งกำลังบำรุงฯ)</w:t>
@@ -200,13 +200,14 @@
     </w:p>
     <w:p>
       <w:pPr>
-        <w:spacing w:after="40" w:line="360" w:lineRule="auto"/>
+        <w:spacing w:after="40" w:line="300" w:lineRule="auto"/>
       </w:pPr>
       <w:r>
         <w:rPr>
           <w:rFonts w:ascii="TH Sarabun PSK" w:hAnsi="TH Sarabun PSK"/>
           <w:b/>
-          <w:sz w:val="28"/>
+          <w:i w:val="0"/>
+          <w:sz w:val="40"/>
           <w:rFonts w:ascii="TH Sarabun PSK" w:hAnsi="TH Sarabun PSK" w:cs="TH Sarabun PSK"/>
         </w:rPr>
         <w:t xml:space="preserve">อ้างถึง  </w:t>
@@ -215,7 +216,8 @@
         <w:rPr>
           <w:rFonts w:ascii="TH Sarabun PSK" w:hAnsi="TH Sarabun PSK"/>
           <w:b w:val="0"/>
-          <w:sz w:val="24"/>
+          <w:i w:val="0"/>
+          <w:sz w:val="34"/>
           <w:rFonts w:ascii="TH Sarabun PSK" w:hAnsi="TH Sarabun PSK" w:cs="TH Sarabun PSK"/>
         </w:rPr>
         <w:t>๑. ระเบียบ ทบ. ว่าด้วยส่งกำลังสิ่งอุปกรณ์ประเภท ๒ และ ๔ พ.ศ. ๒๕๓๔</w:t>
@@ -223,13 +225,14 @@
     </w:p>
     <w:p>
       <w:pPr>
-        <w:spacing w:after="40" w:line="360" w:lineRule="auto"/>
+        <w:spacing w:after="40" w:line="300" w:lineRule="auto"/>
       </w:pPr>
       <w:r>
         <w:rPr>
           <w:rFonts w:ascii="TH Sarabun PSK" w:hAnsi="TH Sarabun PSK"/>
           <w:b/>
-          <w:sz w:val="28"/>
+          <w:i w:val="0"/>
+          <w:sz w:val="34"/>
           <w:rFonts w:ascii="TH Sarabun PSK" w:hAnsi="TH Sarabun PSK" w:cs="TH Sarabun PSK"/>
         </w:rPr>
         <w:t xml:space="preserve">สิ่งที่ส่งมาด้วย  </w:t>
@@ -238,7 +241,8 @@
         <w:rPr>
           <w:rFonts w:ascii="TH Sarabun PSK" w:hAnsi="TH Sarabun PSK"/>
           <w:b w:val="0"/>
-          <w:sz w:val="24"/>
+          <w:i w:val="0"/>
+          <w:sz w:val="34"/>
           <w:rFonts w:ascii="TH Sarabun PSK" w:hAnsi="TH Sarabun PSK" w:cs="TH Sarabun PSK"/>
         </w:rPr>
         <w:t>ใบติดตามใบส่งซ่อม สิ่งอุปกรณ์ ทบ.๔๐๐-๐๗๑     จำนวน  ๑  ฉบับ</w:t>
@@ -246,7 +250,7 @@
     </w:p>
     <w:p>
       <w:pPr>
-        <w:spacing w:after="80" w:line="360" w:lineRule="auto"/>
+        <w:spacing w:after="80" w:line="300" w:lineRule="auto"/>
         <w:ind w:firstLine="1411"/>
         <w:jc w:val="both"/>
       </w:pPr>
@@ -254,7 +258,8 @@
         <w:rPr>
           <w:rFonts w:ascii="TH Sarabun PSK" w:hAnsi="TH Sarabun PSK"/>
           <w:b w:val="0"/>
-          <w:sz w:val="24"/>
+          <w:i w:val="0"/>
+          <w:sz w:val="34"/>
           <w:rFonts w:ascii="TH Sarabun PSK" w:hAnsi="TH Sarabun PSK" w:cs="TH Sarabun PSK"/>
         </w:rPr>
         <w:t>ป.๔ พัน.๔ ร้อย.๒ ขอติดตามใบส่งซ่อมเกิน ๙๐ วัน สิ่งอุปกรณ์ของ ปบค.๙๕ ขนาด ๑๐๕ มม. เอ็ม.๑๐๑ เอ.๑ ปรับปรุง รายละเอียดตามสิ่งที่ส่งมาด้วย</w:t>
@@ -262,7 +267,7 @@
     </w:p>
     <w:p>
       <w:pPr>
-        <w:spacing w:after="80" w:line="360" w:lineRule="auto"/>
+        <w:spacing w:after="80" w:line="300" w:lineRule="auto"/>
         <w:ind w:firstLine="1411"/>
         <w:jc w:val="both"/>
       </w:pPr>
@@ -270,7 +275,8 @@
         <w:rPr>
           <w:rFonts w:ascii="TH Sarabun PSK" w:hAnsi="TH Sarabun PSK"/>
           <w:b w:val="0"/>
-          <w:sz w:val="24"/>
+          <w:i w:val="0"/>
+          <w:sz w:val="34"/>
           <w:rFonts w:ascii="TH Sarabun PSK" w:hAnsi="TH Sarabun PSK" w:cs="TH Sarabun PSK"/>
         </w:rPr>
         <w:t>จึงเรียนมาเพื่อกรุณาพิจารณา</w:t>
@@ -278,26 +284,108 @@
     </w:p>
     <w:p>
       <w:pPr>
-        <w:spacing w:before="1100"/>
-        <w:ind w:left="5947"/>
+        <w:tabs>
+          <w:tab w:pos="5947" w:val="right"/>
+        </w:tabs>
+        <w:spacing w:before="0" w:after="440"/>
       </w:pPr>
       <w:r>
         <w:rPr>
           <w:rFonts w:ascii="TH Sarabun PSK" w:hAnsi="TH Sarabun PSK"/>
           <w:b w:val="0"/>
-          <w:sz w:val="24"/>
+          <w:sz w:val="34"/>
+        </w:rPr>
+        <w:tab/>
+        <w:t>ร.อ.</w:t>
+      </w:r>
+    </w:p>
+    <w:p>
+      <w:pPr>
+        <w:tabs>
+          <w:tab w:pos="5947" w:val="left"/>
+        </w:tabs>
+        <w:spacing w:before="0" w:after="0"/>
+      </w:pPr>
+      <w:r>
+        <w:rPr>
+          <w:rFonts w:ascii="TH Sarabun PSK" w:hAnsi="TH Sarabun PSK"/>
+          <w:b w:val="0"/>
+          <w:sz w:val="34"/>
+        </w:rPr>
+        <w:tab/>
+        <w:t>(กฤติน  นราพงษ์)</w:t>
+      </w:r>
+    </w:p>
+    <w:p>
+      <w:pPr>
+        <w:tabs>
+          <w:tab w:pos="7315" w:val="center"/>
+        </w:tabs>
+        <w:spacing w:before="0" w:after="0"/>
+      </w:pPr>
+      <w:r>
+        <w:rPr>
+          <w:rFonts w:ascii="TH Sarabun PSK" w:hAnsi="TH Sarabun PSK"/>
+          <w:b w:val="0"/>
+          <w:sz w:val="34"/>
+        </w:rPr>
+        <w:tab/>
+        <w:t>ผบ.ป.๔ พัน.๔ ร้อย.๒</w:t>
+      </w:r>
+    </w:p>
+    <w:p>
+      <w:pPr>
+        <w:tabs>
+          <w:tab w:pos="6480" w:val="left"/>
+          <w:tab w:pos="7920" w:val="left"/>
+          <w:tab w:pos="9216" w:val="left"/>
+        </w:tabs>
+        <w:spacing w:before="600" w:after="0"/>
+      </w:pPr>
+      <w:r>
+        <w:rPr>
+          <w:rFonts w:ascii="TH Sarabun PSK" w:hAnsi="TH Sarabun PSK"/>
+          <w:b w:val="0"/>
+          <w:i w:val="0"/>
+          <w:sz w:val="27"/>
           <w:rFonts w:ascii="TH Sarabun PSK" w:hAnsi="TH Sarabun PSK" w:cs="TH Sarabun PSK"/>
         </w:rPr>
-        <w:t>ร.อ.</w:t>
-        <w:br/>
-        <w:t>(กฤติน  นราพงษ์)</w:t>
-        <w:br/>
-        <w:t>ผบ.ป.๔ พัน.๔ ร้อย.๒</w:t>
+        <w:tab/>
+        <w:t>จ.ส.อ.</w:t>
+        <w:tab/>
+        <w:t>ร่าง/ตรวจ</w:t>
+        <w:tab/>
+        <w:t>ก.ย. ๖๙</w:t>
+      </w:r>
+    </w:p>
+    <w:p>
+      <w:pPr>
+        <w:tabs>
+          <w:tab w:pos="6480" w:val="left"/>
+          <w:tab w:pos="7920" w:val="left"/>
+          <w:tab w:pos="9216" w:val="left"/>
+        </w:tabs>
+        <w:spacing w:before="0" w:after="0"/>
+      </w:pPr>
+      <w:r>
+        <w:rPr>
+          <w:rFonts w:ascii="TH Sarabun PSK" w:hAnsi="TH Sarabun PSK"/>
+          <w:b w:val="0"/>
+          <w:i w:val="0"/>
+          <w:sz w:val="27"/>
+          <w:rFonts w:ascii="TH Sarabun PSK" w:hAnsi="TH Sarabun PSK" w:cs="TH Sarabun PSK"/>
+        </w:rPr>
+        <w:tab/>
+        <w:t>ส.อ. อวิวัฒน์ฯ</w:t>
+        <w:tab/>
+        <w:t>พิมพ์/ทาน</w:t>
+        <w:tab/>
+        <w:t>๑๘ ก.ย. ๖๙</w:t>
       </w:r>
     </w:p>
     <w:sectPr>
       <w:pgSz w:w="11909" w:h="16834"/>
-      <w:pgMar w:top="1411" w:right="1138" w:bottom="1138" w:left="1411" w:header="720" w:footer="720" w:gutter="0"/>
+      <w:pgMar w:top="850" w:right="850" w:bottom="850" w:left="1411" w:header="720" w:footer="720" w:gutter="0"/>
       <w:cols w:space="720"/>
       <w:docGrid w:linePitch="360"/>
     </w:sectPr>

</xml_diff>